<commit_message>
docs: integrate 6 UI/UX screenshots into submission-ready Luminous_Summary document
</commit_message>
<xml_diff>
--- a/docs/Luminous_Summary.docx
+++ b/docs/Luminous_Summary.docx
@@ -60,6 +60,61 @@
     <w:p>
       <w:r>
         <w:t>Problem 2: AI-Powered Smart College/School ERP &amp; Campus Safety Platform. The challenge calls for a unified and secure education management platform covering institutional administration and campus safety, including student management, attendance, fees, exams, timetables, faculty management, communication, transport, hostel, placement, parent communication and complaints, with a dedicated campus safety and security layer.</w:t>
+      </w:r>
+    </w:p>
+    <w:p>
+      <w:pPr>
+        <w:spacing w:before="120" w:after="40"/>
+        <w:jc w:val="center"/>
+      </w:pPr>
+      <w:r>
+        <w:drawing>
+          <wp:inline xmlns:a="http://schemas.openxmlformats.org/drawingml/2006/main" xmlns:pic="http://schemas.openxmlformats.org/drawingml/2006/picture">
+            <wp:extent cx="5669280" cy="2880431"/>
+            <wp:docPr id="1" name="Picture 1"/>
+            <wp:cNvGraphicFramePr>
+              <a:graphicFrameLocks noChangeAspect="1"/>
+            </wp:cNvGraphicFramePr>
+            <a:graphic>
+              <a:graphicData uri="http://schemas.openxmlformats.org/drawingml/2006/picture">
+                <pic:pic>
+                  <pic:nvPicPr>
+                    <pic:cNvPr id="0" name="image1.png"/>
+                    <pic:cNvPicPr/>
+                  </pic:nvPicPr>
+                  <pic:blipFill>
+                    <a:blip r:embed="rId9"/>
+                    <a:stretch>
+                      <a:fillRect/>
+                    </a:stretch>
+                  </pic:blipFill>
+                  <pic:spPr>
+                    <a:xfrm>
+                      <a:off x="0" y="0"/>
+                      <a:ext cx="5669280" cy="2880431"/>
+                    </a:xfrm>
+                    <a:prstGeom prst="rect"/>
+                  </pic:spPr>
+                </pic:pic>
+              </a:graphicData>
+            </a:graphic>
+          </wp:inline>
+        </w:drawing>
+      </w:r>
+    </w:p>
+    <w:p>
+      <w:pPr>
+        <w:spacing w:before="0" w:after="200"/>
+        <w:jc w:val="center"/>
+      </w:pPr>
+      <w:r>
+        <w:rPr>
+          <w:rFonts w:ascii="Calibri" w:hAnsi="Calibri"/>
+          <w:i/>
+          <w:color w:val="4B5563"/>
+          <w:sz w:val="19"/>
+        </w:rPr>
+        <w:t>Figure 1: Luminous AI Landing Page — Homepage Hero and Primary Platform Positioning</w:t>
       </w:r>
     </w:p>
     <w:p>
@@ -627,6 +682,61 @@
       </w:tr>
     </w:tbl>
     <w:p/>
+    <w:p>
+      <w:pPr>
+        <w:spacing w:before="120" w:after="40"/>
+        <w:jc w:val="center"/>
+      </w:pPr>
+      <w:r>
+        <w:drawing>
+          <wp:inline xmlns:a="http://schemas.openxmlformats.org/drawingml/2006/main" xmlns:pic="http://schemas.openxmlformats.org/drawingml/2006/picture">
+            <wp:extent cx="5669280" cy="2881983"/>
+            <wp:docPr id="2" name="Picture 2"/>
+            <wp:cNvGraphicFramePr>
+              <a:graphicFrameLocks noChangeAspect="1"/>
+            </wp:cNvGraphicFramePr>
+            <a:graphic>
+              <a:graphicData uri="http://schemas.openxmlformats.org/drawingml/2006/picture">
+                <pic:pic>
+                  <pic:nvPicPr>
+                    <pic:cNvPr id="0" name="image2.png"/>
+                    <pic:cNvPicPr/>
+                  </pic:nvPicPr>
+                  <pic:blipFill>
+                    <a:blip r:embed="rId10"/>
+                    <a:stretch>
+                      <a:fillRect/>
+                    </a:stretch>
+                  </pic:blipFill>
+                  <pic:spPr>
+                    <a:xfrm>
+                      <a:off x="0" y="0"/>
+                      <a:ext cx="5669280" cy="2881983"/>
+                    </a:xfrm>
+                    <a:prstGeom prst="rect"/>
+                  </pic:spPr>
+                </pic:pic>
+              </a:graphicData>
+            </a:graphic>
+          </wp:inline>
+        </w:drawing>
+      </w:r>
+    </w:p>
+    <w:p>
+      <w:pPr>
+        <w:spacing w:before="0" w:after="200"/>
+        <w:jc w:val="center"/>
+      </w:pPr>
+      <w:r>
+        <w:rPr>
+          <w:rFonts w:ascii="Calibri" w:hAnsi="Calibri"/>
+          <w:i/>
+          <w:color w:val="4B5563"/>
+          <w:sz w:val="19"/>
+        </w:rPr>
+        <w:t>Figure 2: Feature Pillars &amp; Institutional Capabilities Architecture</w:t>
+      </w:r>
+    </w:p>
     <w:p>
       <w:pPr>
         <w:pStyle w:val="Heading2"/>
@@ -1431,7 +1541,108 @@
         <w:pStyle w:val="Heading2"/>
       </w:pPr>
       <w:r>
-        <w:t>4.3 Automated AI Incident Classification &amp; Grievance Triage</w:t>
+        <w:t>4.3 Live Campus Map &amp; Severity Visualization</w:t>
+      </w:r>
+    </w:p>
+    <w:p>
+      <w:pPr>
+        <w:pStyle w:val="ListBullet"/>
+        <w:spacing w:after="60" w:before="0"/>
+      </w:pPr>
+      <w:r>
+        <w:rPr>
+          <w:b/>
+          <w:color w:val="000000"/>
+        </w:rPr>
+        <w:t xml:space="preserve">Interactive Spatial Topology: </w:t>
+      </w:r>
+      <w:r>
+        <w:rPr>
+          <w:sz w:val="21"/>
+        </w:rPr>
+        <w:t>Visualizes campus buildings, active incident pins, real-time security patrol markers, and zone severity overlays.</w:t>
+      </w:r>
+    </w:p>
+    <w:p>
+      <w:pPr>
+        <w:pStyle w:val="ListBullet"/>
+        <w:spacing w:after="60" w:before="0"/>
+      </w:pPr>
+      <w:r>
+        <w:rPr>
+          <w:b/>
+          <w:color w:val="000000"/>
+        </w:rPr>
+        <w:t xml:space="preserve">Severity-Driven Overlays: </w:t>
+      </w:r>
+      <w:r>
+        <w:rPr>
+          <w:sz w:val="21"/>
+        </w:rPr>
+        <w:t>Color-coded severity markers (Critical, High, Medium, Low) enable security dispatchers to triage multi-location events instantly.</w:t>
+      </w:r>
+    </w:p>
+    <w:p>
+      <w:pPr>
+        <w:spacing w:before="120" w:after="40"/>
+        <w:jc w:val="center"/>
+      </w:pPr>
+      <w:r>
+        <w:drawing>
+          <wp:inline xmlns:a="http://schemas.openxmlformats.org/drawingml/2006/main" xmlns:pic="http://schemas.openxmlformats.org/drawingml/2006/picture">
+            <wp:extent cx="5669280" cy="2938564"/>
+            <wp:docPr id="3" name="Picture 3"/>
+            <wp:cNvGraphicFramePr>
+              <a:graphicFrameLocks noChangeAspect="1"/>
+            </wp:cNvGraphicFramePr>
+            <a:graphic>
+              <a:graphicData uri="http://schemas.openxmlformats.org/drawingml/2006/picture">
+                <pic:pic>
+                  <pic:nvPicPr>
+                    <pic:cNvPr id="0" name="image6.png"/>
+                    <pic:cNvPicPr/>
+                  </pic:nvPicPr>
+                  <pic:blipFill>
+                    <a:blip r:embed="rId11"/>
+                    <a:stretch>
+                      <a:fillRect/>
+                    </a:stretch>
+                  </pic:blipFill>
+                  <pic:spPr>
+                    <a:xfrm>
+                      <a:off x="0" y="0"/>
+                      <a:ext cx="5669280" cy="2938564"/>
+                    </a:xfrm>
+                    <a:prstGeom prst="rect"/>
+                  </pic:spPr>
+                </pic:pic>
+              </a:graphicData>
+            </a:graphic>
+          </wp:inline>
+        </w:drawing>
+      </w:r>
+    </w:p>
+    <w:p>
+      <w:pPr>
+        <w:spacing w:before="0" w:after="200"/>
+        <w:jc w:val="center"/>
+      </w:pPr>
+      <w:r>
+        <w:rPr>
+          <w:rFonts w:ascii="Calibri" w:hAnsi="Calibri"/>
+          <w:i/>
+          <w:color w:val="4B5563"/>
+          <w:sz w:val="19"/>
+        </w:rPr>
+        <w:t>Figure 3: Live Campus Map — Severity-Coded Incident Visualization Across Institutional Locations</w:t>
+      </w:r>
+    </w:p>
+    <w:p>
+      <w:pPr>
+        <w:pStyle w:val="Heading2"/>
+      </w:pPr>
+      <w:r>
+        <w:t>4.4 Automated AI Incident Classification &amp; Grievance Triage</w:t>
       </w:r>
     </w:p>
     <w:p>
@@ -1515,7 +1726,7 @@
         <w:pStyle w:val="Heading2"/>
       </w:pPr>
       <w:r>
-        <w:t>4.4 AI Predictive Risk Intelligence &amp; Pattern Mining</w:t>
+        <w:t>4.5 AI Predictive Risk Intelligence &amp; Pattern Mining</w:t>
       </w:r>
     </w:p>
     <w:p>
@@ -1580,7 +1791,7 @@
         <w:pStyle w:val="Heading2"/>
       </w:pPr>
       <w:r>
-        <w:t>4.5 Mental Health Crisis Triage &amp; Counselor Warm Handoff</w:t>
+        <w:t>4.6 Mental Health Crisis Triage &amp; Counselor Warm Handoff</w:t>
       </w:r>
     </w:p>
     <w:p>
@@ -1645,7 +1856,7 @@
         <w:pStyle w:val="Heading2"/>
       </w:pPr>
       <w:r>
-        <w:t>4.6 Zero-Trust Campus Copilot &amp; Student Privacy (FERPA)</w:t>
+        <w:t>4.7 Zero-Trust CampusShield AI Copilot</w:t>
       </w:r>
     </w:p>
     <w:p>
@@ -1707,10 +1918,65 @@
     </w:p>
     <w:p>
       <w:pPr>
+        <w:spacing w:before="120" w:after="40"/>
+        <w:jc w:val="center"/>
+      </w:pPr>
+      <w:r>
+        <w:drawing>
+          <wp:inline xmlns:a="http://schemas.openxmlformats.org/drawingml/2006/main" xmlns:pic="http://schemas.openxmlformats.org/drawingml/2006/picture">
+            <wp:extent cx="5669280" cy="4513112"/>
+            <wp:docPr id="4" name="Picture 4"/>
+            <wp:cNvGraphicFramePr>
+              <a:graphicFrameLocks noChangeAspect="1"/>
+            </wp:cNvGraphicFramePr>
+            <a:graphic>
+              <a:graphicData uri="http://schemas.openxmlformats.org/drawingml/2006/picture">
+                <pic:pic>
+                  <pic:nvPicPr>
+                    <pic:cNvPr id="0" name="image5.png"/>
+                    <pic:cNvPicPr/>
+                  </pic:nvPicPr>
+                  <pic:blipFill>
+                    <a:blip r:embed="rId12"/>
+                    <a:stretch>
+                      <a:fillRect/>
+                    </a:stretch>
+                  </pic:blipFill>
+                  <pic:spPr>
+                    <a:xfrm>
+                      <a:off x="0" y="0"/>
+                      <a:ext cx="5669280" cy="4513112"/>
+                    </a:xfrm>
+                    <a:prstGeom prst="rect"/>
+                  </pic:spPr>
+                </pic:pic>
+              </a:graphicData>
+            </a:graphic>
+          </wp:inline>
+        </w:drawing>
+      </w:r>
+    </w:p>
+    <w:p>
+      <w:pPr>
+        <w:spacing w:before="0" w:after="200"/>
+        <w:jc w:val="center"/>
+      </w:pPr>
+      <w:r>
+        <w:rPr>
+          <w:rFonts w:ascii="Calibri" w:hAnsi="Calibri"/>
+          <w:i/>
+          <w:color w:val="4B5563"/>
+          <w:sz w:val="19"/>
+        </w:rPr>
+        <w:t>Figure 4: CampusShield AI Copilot — Natural Language Operational Interface with Server-Side RBAC Guard</w:t>
+      </w:r>
+    </w:p>
+    <w:p>
+      <w:pPr>
         <w:pStyle w:val="Heading2"/>
       </w:pPr>
       <w:r>
-        <w:t>4.7 Zero-Knowledge Privacy Architecture (Ghost Mode)</w:t>
+        <w:t>4.8 Zero-Knowledge Privacy Architecture (Ghost Mode)</w:t>
       </w:r>
     </w:p>
     <w:p>
@@ -1775,7 +2041,7 @@
         <w:pStyle w:val="Heading2"/>
       </w:pPr>
       <w:r>
-        <w:t>4.8 Campus ERP Integrations (Attendance, Hostel, Leave Passes)</w:t>
+        <w:t>4.9 Campus ERP Integrations (Attendance, Hostel, Leave Passes)</w:t>
       </w:r>
     </w:p>
     <w:p>
@@ -5355,6 +5621,61 @@
     <w:p/>
     <w:p>
       <w:pPr>
+        <w:spacing w:before="120" w:after="40"/>
+        <w:jc w:val="center"/>
+      </w:pPr>
+      <w:r>
+        <w:drawing>
+          <wp:inline xmlns:a="http://schemas.openxmlformats.org/drawingml/2006/main" xmlns:pic="http://schemas.openxmlformats.org/drawingml/2006/picture">
+            <wp:extent cx="5029200" cy="2544739"/>
+            <wp:docPr id="5" name="Picture 5"/>
+            <wp:cNvGraphicFramePr>
+              <a:graphicFrameLocks noChangeAspect="1"/>
+            </wp:cNvGraphicFramePr>
+            <a:graphic>
+              <a:graphicData uri="http://schemas.openxmlformats.org/drawingml/2006/picture">
+                <pic:pic>
+                  <pic:nvPicPr>
+                    <pic:cNvPr id="0" name="image3.png"/>
+                    <pic:cNvPicPr/>
+                  </pic:nvPicPr>
+                  <pic:blipFill>
+                    <a:blip r:embed="rId13"/>
+                    <a:stretch>
+                      <a:fillRect/>
+                    </a:stretch>
+                  </pic:blipFill>
+                  <pic:spPr>
+                    <a:xfrm>
+                      <a:off x="0" y="0"/>
+                      <a:ext cx="5029200" cy="2544739"/>
+                    </a:xfrm>
+                    <a:prstGeom prst="rect"/>
+                  </pic:spPr>
+                </pic:pic>
+              </a:graphicData>
+            </a:graphic>
+          </wp:inline>
+        </w:drawing>
+      </w:r>
+    </w:p>
+    <w:p>
+      <w:pPr>
+        <w:spacing w:before="0" w:after="200"/>
+        <w:jc w:val="center"/>
+      </w:pPr>
+      <w:r>
+        <w:rPr>
+          <w:rFonts w:ascii="Calibri" w:hAnsi="Calibri"/>
+          <w:i/>
+          <w:color w:val="4B5563"/>
+          <w:sz w:val="19"/>
+        </w:rPr>
+        <w:t>Figure 5: Institutional Authentication Screen — Focused Sign-In &amp; Role Resolution Flow</w:t>
+      </w:r>
+    </w:p>
+    <w:p>
+      <w:pPr>
         <w:pStyle w:val="Heading1"/>
       </w:pPr>
       <w:r>
@@ -5976,7 +6297,7 @@
         <w:pStyle w:val="Heading1"/>
       </w:pPr>
       <w:r>
-        <w:t>9. UI/UX Design Language</w:t>
+        <w:t>9. UI/UX Design Language &amp; Role Dashboards</w:t>
       </w:r>
     </w:p>
     <w:p>
@@ -6043,21 +6364,57 @@
     </w:p>
     <w:p>
       <w:pPr>
-        <w:pStyle w:val="ListBullet"/>
-        <w:spacing w:after="60" w:before="0"/>
+        <w:spacing w:before="120" w:after="40"/>
+        <w:jc w:val="center"/>
+      </w:pPr>
+      <w:r>
+        <w:drawing>
+          <wp:inline xmlns:a="http://schemas.openxmlformats.org/drawingml/2006/main" xmlns:pic="http://schemas.openxmlformats.org/drawingml/2006/picture">
+            <wp:extent cx="5669280" cy="2812483"/>
+            <wp:docPr id="6" name="Picture 6"/>
+            <wp:cNvGraphicFramePr>
+              <a:graphicFrameLocks noChangeAspect="1"/>
+            </wp:cNvGraphicFramePr>
+            <a:graphic>
+              <a:graphicData uri="http://schemas.openxmlformats.org/drawingml/2006/picture">
+                <pic:pic>
+                  <pic:nvPicPr>
+                    <pic:cNvPr id="0" name="image4.png"/>
+                    <pic:cNvPicPr/>
+                  </pic:nvPicPr>
+                  <pic:blipFill>
+                    <a:blip r:embed="rId14"/>
+                    <a:stretch>
+                      <a:fillRect/>
+                    </a:stretch>
+                  </pic:blipFill>
+                  <pic:spPr>
+                    <a:xfrm>
+                      <a:off x="0" y="0"/>
+                      <a:ext cx="5669280" cy="2812483"/>
+                    </a:xfrm>
+                    <a:prstGeom prst="rect"/>
+                  </pic:spPr>
+                </pic:pic>
+              </a:graphicData>
+            </a:graphic>
+          </wp:inline>
+        </w:drawing>
+      </w:r>
+    </w:p>
+    <w:p>
+      <w:pPr>
+        <w:spacing w:before="0" w:after="200"/>
+        <w:jc w:val="center"/>
       </w:pPr>
       <w:r>
         <w:rPr>
-          <w:b/>
-          <w:color w:val="000000"/>
+          <w:rFonts w:ascii="Calibri" w:hAnsi="Calibri"/>
+          <w:i/>
+          <w:color w:val="4B5563"/>
+          <w:sz w:val="19"/>
         </w:rPr>
-        <w:t xml:space="preserve">Campus Map: </w:t>
-      </w:r>
-      <w:r>
-        <w:rPr>
-          <w:sz w:val="21"/>
-        </w:rPr>
-        <w:t>Interactive SVG campus map with zone risk overlays, incident pins, and live security patrol markers.</w:t>
+        <w:t>Figure 6: Role-Specific Operational Dashboard (Faculty View) — Combining Academic Workflows &amp; Real-Time Safety Telemetry</w:t>
       </w:r>
     </w:p>
     <w:p>

</xml_diff>